<commit_message>
docs: agrega la evidencia del repositorio GitHub en las plantillas
Doc 1 (Plantillas_UMG_Completadas.docx): la seccion 10 (Evidencias y documentacion tecnica) ahora referencia https://github.com/ravenc1/setesa_gestion_ausencias (rama main, commit inicial 48d2836) y storage/. Doc 2 (Plantillas_Imagen_Completadas.docx): se agrega la Plantilla 9 'Evidencias y documentacion tecnica' con el repositorio, la documentacion tecnica real del proyecto y las restricciones de acceso. Se actualizan los generadores correspondientes.
</commit_message>
<xml_diff>
--- a/proyecto_doc/plantillas_llenadas/Plantillas_Imagen_Completadas.docx
+++ b/proyecto_doc/plantillas_llenadas/Plantillas_Imagen_Completadas.docx
@@ -2595,6 +2595,273 @@
         </w:tc>
       </w:tr>
     </w:tbl>
+    <w:p>
+      <w:r>
+        <w:br w:type="page"/>
+      </w:r>
+    </w:p>
+    <w:p>
+      <w:r>
+        <w:rPr>
+          <w:b/>
+          <w:color w:val="1F6FB2"/>
+          <w:sz w:val="26"/>
+        </w:rPr>
+        <w:t>PLANTILLA 9.  EVIDENCIAS Y DOCUMENTACIÓN TÉCNICA</w:t>
+      </w:r>
+    </w:p>
+    <w:p>
+      <w:pPr>
+        <w:spacing w:after="120"/>
+      </w:pPr>
+      <w:r>
+        <w:rPr>
+          <w:i/>
+          <w:sz w:val="19"/>
+        </w:rPr>
+        <w:t>Documenta dónde se resguardan las evidencias y la documentación técnica de la implementación.</w:t>
+      </w:r>
+    </w:p>
+    <w:tbl>
+      <w:tblPr>
+        <w:tblStyle w:val="TableGrid"/>
+        <w:tblW w:type="auto" w:w="0"/>
+        <w:jc w:val="center"/>
+        <w:tblLook w:firstColumn="1" w:firstRow="1" w:lastColumn="0" w:lastRow="0" w:noHBand="0" w:noVBand="1" w:val="04A0"/>
+      </w:tblPr>
+      <w:tblGrid>
+        <w:gridCol w:w="4320"/>
+        <w:gridCol w:w="4320"/>
+      </w:tblGrid>
+      <w:tr>
+        <w:tc>
+          <w:tcPr>
+            <w:tcW w:type="dxa" w:w="4320"/>
+            <w:shd w:val="clear" w:color="auto" w:fill="1F6FB2"/>
+          </w:tcPr>
+          <w:p>
+            <w:r/>
+            <w:r>
+              <w:rPr>
+                <w:b/>
+                <w:color w:val="FFFFFF"/>
+                <w:sz w:val="19"/>
+              </w:rPr>
+              <w:t>Elemento</w:t>
+            </w:r>
+          </w:p>
+        </w:tc>
+        <w:tc>
+          <w:tcPr>
+            <w:tcW w:type="dxa" w:w="4320"/>
+            <w:shd w:val="clear" w:color="auto" w:fill="1F6FB2"/>
+          </w:tcPr>
+          <w:p>
+            <w:r/>
+            <w:r>
+              <w:rPr>
+                <w:b/>
+                <w:color w:val="FFFFFF"/>
+                <w:sz w:val="19"/>
+              </w:rPr>
+              <w:t>Detalle</w:t>
+            </w:r>
+          </w:p>
+        </w:tc>
+      </w:tr>
+      <w:tr>
+        <w:tc>
+          <w:tcPr>
+            <w:tcW w:type="dxa" w:w="4320"/>
+          </w:tcPr>
+          <w:p>
+            <w:r/>
+            <w:r>
+              <w:rPr>
+                <w:b w:val="0"/>
+                <w:sz w:val="19"/>
+              </w:rPr>
+              <w:t>Repositorio de código fuente (GitHub)</w:t>
+            </w:r>
+          </w:p>
+        </w:tc>
+        <w:tc>
+          <w:tcPr>
+            <w:tcW w:type="dxa" w:w="4320"/>
+          </w:tcPr>
+          <w:p>
+            <w:r/>
+            <w:r>
+              <w:rPr>
+                <w:b w:val="0"/>
+                <w:sz w:val="19"/>
+              </w:rPr>
+              <w:t>https://github.com/ravenc1/setesa_gestion_ausencias — repositorio público, rama "main", commit inicial 48d2836 (16/10/2026), correspondiente a la versión 1.0 del sistema SETESA Workflow.</w:t>
+            </w:r>
+          </w:p>
+        </w:tc>
+      </w:tr>
+      <w:tr>
+        <w:tc>
+          <w:tcPr>
+            <w:tcW w:type="dxa" w:w="4320"/>
+          </w:tcPr>
+          <w:p>
+            <w:r/>
+            <w:r>
+              <w:rPr>
+                <w:b w:val="0"/>
+                <w:sz w:val="19"/>
+              </w:rPr>
+              <w:t>Ubicación de evidencias</w:t>
+            </w:r>
+          </w:p>
+        </w:tc>
+        <w:tc>
+          <w:tcPr>
+            <w:tcW w:type="dxa" w:w="4320"/>
+          </w:tcPr>
+          <w:p>
+            <w:r/>
+            <w:r>
+              <w:rPr>
+                <w:b w:val="0"/>
+                <w:sz w:val="19"/>
+              </w:rPr>
+              <w:t>Repositorio GitHub del proyecto y carpeta storage/ (subcarpetas pdf y firmas). El código se organiza en app.py (punto de entrada), src/core (autenticación, catálogos, workflow, base de datos), src/features (registro, coordinador, vigencia, dashboard) y src/services (motor PDF y firmas).</w:t>
+            </w:r>
+          </w:p>
+        </w:tc>
+      </w:tr>
+      <w:tr>
+        <w:tc>
+          <w:tcPr>
+            <w:tcW w:type="dxa" w:w="4320"/>
+          </w:tcPr>
+          <w:p>
+            <w:r/>
+            <w:r>
+              <w:rPr>
+                <w:b w:val="0"/>
+                <w:sz w:val="19"/>
+              </w:rPr>
+              <w:t>Convención de nombres</w:t>
+            </w:r>
+          </w:p>
+        </w:tc>
+        <w:tc>
+          <w:tcPr>
+            <w:tcW w:type="dxa" w:w="4320"/>
+          </w:tcPr>
+          <w:p>
+            <w:r/>
+            <w:r>
+              <w:rPr>
+                <w:b w:val="0"/>
+                <w:sz w:val="19"/>
+              </w:rPr>
+              <w:t>Casos de prueba: PR-0X_caso-prueba_fecha; expedientes PDF: accion_&lt;usuario&gt;_&lt;id&gt;d.pdf.</w:t>
+            </w:r>
+          </w:p>
+        </w:tc>
+      </w:tr>
+      <w:tr>
+        <w:tc>
+          <w:tcPr>
+            <w:tcW w:type="dxa" w:w="4320"/>
+          </w:tcPr>
+          <w:p>
+            <w:r/>
+            <w:r>
+              <w:rPr>
+                <w:b w:val="0"/>
+                <w:sz w:val="19"/>
+              </w:rPr>
+              <w:t>Documentación técnica</w:t>
+            </w:r>
+          </w:p>
+        </w:tc>
+        <w:tc>
+          <w:tcPr>
+            <w:tcW w:type="dxa" w:w="4320"/>
+          </w:tcPr>
+          <w:p>
+            <w:r/>
+            <w:r>
+              <w:rPr>
+                <w:b w:val="0"/>
+                <w:sz w:val="19"/>
+              </w:rPr>
+              <w:t>docs/ESTRUCTURA.md (arquitectura y estructura de carpetas), requirements.txt (dependencias), tests/smoke_test.py (pruebas de humo), .env.example (variables de entorno), scripts/hash_passwords.py y el informe del proyecto de graduación (PG2_Proyecto_Pagina_Web_SETESA_RicardoArias.pdf).</w:t>
+            </w:r>
+          </w:p>
+        </w:tc>
+      </w:tr>
+      <w:tr>
+        <w:tc>
+          <w:tcPr>
+            <w:tcW w:type="dxa" w:w="4320"/>
+          </w:tcPr>
+          <w:p>
+            <w:r/>
+            <w:r>
+              <w:rPr>
+                <w:b w:val="0"/>
+                <w:sz w:val="19"/>
+              </w:rPr>
+              <w:t>Responsable de custodia</w:t>
+            </w:r>
+          </w:p>
+        </w:tc>
+        <w:tc>
+          <w:tcPr>
+            <w:tcW w:type="dxa" w:w="4320"/>
+          </w:tcPr>
+          <w:p>
+            <w:r/>
+            <w:r>
+              <w:rPr>
+                <w:b w:val="0"/>
+                <w:sz w:val="19"/>
+              </w:rPr>
+              <w:t>Ricardo Andree Sebastián Arias Conde (Investigador) / Administrador de TI de SETESA.</w:t>
+            </w:r>
+          </w:p>
+        </w:tc>
+      </w:tr>
+      <w:tr>
+        <w:tc>
+          <w:tcPr>
+            <w:tcW w:type="dxa" w:w="4320"/>
+          </w:tcPr>
+          <w:p>
+            <w:r/>
+            <w:r>
+              <w:rPr>
+                <w:b w:val="0"/>
+                <w:sz w:val="19"/>
+              </w:rPr>
+              <w:t>Restricciones de acceso</w:t>
+            </w:r>
+          </w:p>
+        </w:tc>
+        <w:tc>
+          <w:tcPr>
+            <w:tcW w:type="dxa" w:w="4320"/>
+          </w:tcPr>
+          <w:p>
+            <w:r/>
+            <w:r>
+              <w:rPr>
+                <w:b w:val="0"/>
+                <w:sz w:val="19"/>
+              </w:rPr>
+              <w:t>Acceso restringido por RBAC; los datos sensibles solo los visualiza Gerencia. El repositorio es público y no contiene credenciales: el archivo .env está excluido mediante .gitignore.</w:t>
+            </w:r>
+          </w:p>
+        </w:tc>
+      </w:tr>
+    </w:tbl>
     <w:sectPr>
       <w:pgSz w:w="12240" w:h="15840"/>
       <w:pgMar w:top="1440" w:right="1800" w:bottom="1440" w:left="1800" w:header="720" w:footer="720" w:gutter="0"/>

</xml_diff>